<commit_message>
edits and updates to notebook and minor edits to doc
</commit_message>
<xml_diff>
--- a/docs/MarketStructure_Report.docx
+++ b/docs/MarketStructure_Report.docx
@@ -259,8 +259,6 @@
       <w:pPr>
         <w:pStyle w:val="Heading2"/>
         <w:spacing w:before="200" w:after="90"/>
-      </w:pPr>
-      <w:r>
         <w:rPr>
           <w:b/>
           <w:bCs/>
@@ -268,6 +266,35 @@
           <w:sz w:val="23"/>
           <w:szCs w:val="23"/>
         </w:rPr>
+      </w:pPr>
+    </w:p>
+    <w:p>
+      <w:pPr>
+        <w:pStyle w:val="Heading2"/>
+        <w:spacing w:before="200" w:after="90"/>
+        <w:rPr>
+          <w:b/>
+          <w:bCs/>
+          <w:color w:val="000000"/>
+          <w:sz w:val="23"/>
+          <w:szCs w:val="23"/>
+        </w:rPr>
+      </w:pPr>
+    </w:p>
+    <w:p>
+      <w:pPr>
+        <w:pStyle w:val="Heading2"/>
+        <w:spacing w:before="200" w:after="90"/>
+      </w:pPr>
+      <w:r>
+        <w:rPr>
+          <w:b/>
+          <w:bCs/>
+          <w:color w:val="000000"/>
+          <w:sz w:val="23"/>
+          <w:szCs w:val="23"/>
+        </w:rPr>
+        <w:lastRenderedPageBreak/>
         <w:t>2.2 Rolling PCA</w:t>
       </w:r>
     </w:p>
@@ -286,7 +313,6 @@
           <w:b/>
           <w:bCs/>
         </w:rPr>
-        <w:lastRenderedPageBreak/>
         <w:t xml:space="preserve">Estimate the covariance matrix: </w:t>
       </w:r>
       <w:r>
@@ -762,8 +788,6 @@
       <w:pPr>
         <w:pStyle w:val="Heading1"/>
         <w:spacing w:before="260" w:after="120"/>
-      </w:pPr>
-      <w:r>
         <w:rPr>
           <w:b/>
           <w:bCs/>
@@ -771,6 +795,35 @@
           <w:sz w:val="27"/>
           <w:szCs w:val="27"/>
         </w:rPr>
+      </w:pPr>
+    </w:p>
+    <w:p>
+      <w:pPr>
+        <w:pStyle w:val="Heading1"/>
+        <w:spacing w:before="260" w:after="120"/>
+        <w:rPr>
+          <w:b/>
+          <w:bCs/>
+          <w:color w:val="000000"/>
+          <w:sz w:val="27"/>
+          <w:szCs w:val="27"/>
+        </w:rPr>
+      </w:pPr>
+    </w:p>
+    <w:p>
+      <w:pPr>
+        <w:pStyle w:val="Heading1"/>
+        <w:spacing w:before="260" w:after="120"/>
+      </w:pPr>
+      <w:r>
+        <w:rPr>
+          <w:b/>
+          <w:bCs/>
+          <w:color w:val="000000"/>
+          <w:sz w:val="27"/>
+          <w:szCs w:val="27"/>
+        </w:rPr>
+        <w:lastRenderedPageBreak/>
         <w:t>3. Market structure over time</w:t>
       </w:r>
     </w:p>
@@ -792,7 +845,6 @@
         <w:rPr>
           <w:noProof/>
         </w:rPr>
-        <w:lastRenderedPageBreak/>
         <w:drawing>
           <wp:inline distT="0" distB="0" distL="0" distR="0" wp14:anchorId="0D45D2CF" wp14:editId="4AB4FB8E">
             <wp:extent cx="6038850" cy="1990725"/>
@@ -4305,10 +4357,10 @@
         </w:rPr>
         <w:lastRenderedPageBreak/>
         <w:drawing>
-          <wp:inline distT="0" distB="0" distL="0" distR="0" wp14:anchorId="074B9CE8" wp14:editId="7ACF246E">
-            <wp:extent cx="6219825" cy="2457450"/>
-            <wp:effectExtent l="0" t="0" r="0" b="0"/>
-            <wp:docPr id="100010" name="Picture 100010"/>
+          <wp:inline distT="0" distB="0" distL="0" distR="0" wp14:anchorId="1CBC9A2C" wp14:editId="0A734C39">
+            <wp:extent cx="6400800" cy="2525395"/>
+            <wp:effectExtent l="0" t="0" r="0" b="1905"/>
+            <wp:docPr id="1683493067" name="Picture 1"/>
             <wp:cNvGraphicFramePr>
               <a:graphicFrameLocks xmlns:a="http://schemas.openxmlformats.org/drawingml/2006/main" noChangeAspect="1"/>
             </wp:cNvGraphicFramePr>
@@ -4316,7 +4368,7 @@
               <a:graphicData uri="http://schemas.openxmlformats.org/drawingml/2006/picture">
                 <pic:pic xmlns:pic="http://schemas.openxmlformats.org/drawingml/2006/picture">
                   <pic:nvPicPr>
-                    <pic:cNvPr id="100010" name="image100010"/>
+                    <pic:cNvPr id="1683493067" name=""/>
                     <pic:cNvPicPr/>
                   </pic:nvPicPr>
                   <pic:blipFill>
@@ -4328,7 +4380,7 @@
                   <pic:spPr>
                     <a:xfrm>
                       <a:off x="0" y="0"/>
-                      <a:ext cx="6219825" cy="2457450"/>
+                      <a:ext cx="6400800" cy="2525395"/>
                     </a:xfrm>
                     <a:prstGeom prst="rect">
                       <a:avLst/>
@@ -4340,6 +4392,12 @@
           </wp:inline>
         </w:drawing>
       </w:r>
+      <w:r>
+        <w:rPr>
+          <w:noProof/>
+        </w:rPr>
+        <w:t xml:space="preserve"> </w:t>
+      </w:r>
     </w:p>
     <w:p>
       <w:pPr>
@@ -4395,15 +4453,16 @@
         <w:t xml:space="preserve">COVID-19 (2020). </w:t>
       </w:r>
       <w:r>
-        <w:t xml:space="preserve">As a fast, exogenous shock, COVID should behave more like the tariff episode than the GFC, and the onset does: minimum variance's ENB reached its trough just three trading days after the WHO's 11 March pandemic declaration, and the absorption ratio's own peak landed almost exactly on the market's 23 March bottom. The analogy breaks down on depth and recovery, however. The collapse was GFC-deep (entropy-ENB fell 70% and 71% for minimum variance and maximum diversification, Table 3) rather than tariff-shallow, and minimum variance's rebound overshot dramatically, reaching nearly 3x its pre-crash level within a month before settling around 1.8x by the third month (Figure 5), as the optimizer resettled into a smaller, </w:t>
-      </w:r>
-      <w:proofErr w:type="gramStart"/>
-      <w:r>
-        <w:t>differently-composed</w:t>
-      </w:r>
-      <w:proofErr w:type="gramEnd"/>
-      <w:r>
-        <w:t xml:space="preserve"> set of holdings than it held before the crash. Cap-weight, largely inert in the tariff shock, fell a real 17% here. COVID combines the GFC's depth with the tariff shock's speed: a collapse as severe as the slowest episode studied, resolved as fast as the quickest.</w:t>
+        <w:t xml:space="preserve">As a fast, exogenous shock, COVID should behave more like the tariff episode than the GFC, and the onset does: minimum variance's ENB reached its trough just three trading days after the WHO's 11 March pandemic declaration, and the absorption ratio's own peak landed almost exactly on the market's 23 March bottom. The analogy breaks down on depth and recovery, however. The collapse was GFC-deep (entropy-ENB fell 70% and 71% for minimum variance and maximum diversification, Table 3) rather than tariff-shallow, and </w:t>
+      </w:r>
+      <w:r>
+        <w:t>m</w:t>
+      </w:r>
+      <w:r>
+        <w:t>inimum variance's rebound overshot dramatically, climbing to 5.7x its pre-crash level by day 54 before dropping back to around 1.8x by the third month (Figure 5), as the optimizer resettled into a smaller, differently-composed set of holdings than it held before the crash</w:t>
+      </w:r>
+      <w:r>
+        <w:t>. Cap-weight, largely inert in the tariff shock, fell a real 17% here. COVID combines the GFC's depth with the tariff shock's speed: a collapse as severe as the slowest episode studied, resolved as fast as the quickest.</w:t>
       </w:r>
     </w:p>
     <w:p>
@@ -4428,11 +4487,11 @@
         <w:jc w:val="both"/>
       </w:pPr>
       <w:r>
-        <w:t xml:space="preserve">Read together, the three episodes support the same conclusion from three different angles. Naive and risk-budgeted portfolios were never diversified to begin with, so no crisis, slow or fast, financial or exogenous, has much room to compress them further. The optimized portfolios' losses scale with how synchronized the underlying shock is, not with </w:t>
+        <w:t xml:space="preserve">Read together, the three episodes support the same conclusion from three different angles. Naive and risk-budgeted portfolios were never diversified to begin with, so no crisis, slow or fast, financial or exogenous, has much room to </w:t>
       </w:r>
       <w:r>
         <w:lastRenderedPageBreak/>
-        <w:t xml:space="preserve">how long it lasts: COVID's few-week shock cut as deep as the GFC's year-long one. And cap-weight moved meaningfully only when a shock added genuine cross-sectional dispersion on top of a common factor (tariffs, and to a lesser extent COVID) rather than when it was purely a synchronized sell-everything event like the GFC. Diversification, measured this way, is not a fixed property of a portfolio; it is a claim that </w:t>
+        <w:t xml:space="preserve">compress them further. The optimized portfolios' losses scale with how synchronized the underlying shock is, not with how long it lasts: COVID's few-week shock cut as deep as the GFC's year-long one. And cap-weight moved meaningfully only when a shock added genuine cross-sectional dispersion on top of a common factor (tariffs, and to a lesser extent COVID) rather than when it was purely a synchronized sell-everything event like the GFC. Diversification, measured this way, is not a fixed property of a portfolio; it is a claim that </w:t>
       </w:r>
       <w:r>
         <w:t>must</w:t>
@@ -6054,15 +6113,13 @@
         <w:jc w:val="both"/>
       </w:pPr>
       <w:r>
-        <w:t xml:space="preserve">Substituting the </w:t>
-      </w:r>
-      <w:proofErr w:type="spellStart"/>
-      <w:r>
-        <w:t>eigendecomposition</w:t>
-      </w:r>
-      <w:proofErr w:type="spellEnd"/>
-      <w:r>
-        <w:t xml:space="preserve"> of the correlation matrix:</w:t>
+        <w:t>Substituting the eigen</w:t>
+      </w:r>
+      <w:r>
+        <w:t>-</w:t>
+      </w:r>
+      <w:r>
+        <w:t>decomposition of the correlation matrix:</w:t>
       </w:r>
     </w:p>
     <w:p>

</xml_diff>

<commit_message>
Section 2.2 Appendix A reference
</commit_message>
<xml_diff>
--- a/docs/MarketStructure_Report.docx
+++ b/docs/MarketStructure_Report.docx
@@ -387,6 +387,15 @@
       </w:r>
       <w:r>
         <w:t>basis for that date.</w:t>
+      </w:r>
+    </w:p>
+    <w:p>
+      <w:pPr>
+        <w:spacing w:after="160" w:line="276" w:lineRule="auto"/>
+        <w:jc w:val="both"/>
+      </w:pPr>
+      <w:r>
+        <w:t>(Appendix A lists the rationale for each implementation choice made)</w:t>
       </w:r>
     </w:p>
     <w:p>
@@ -823,7 +832,6 @@
           <w:sz w:val="27"/>
           <w:szCs w:val="27"/>
         </w:rPr>
-        <w:lastRenderedPageBreak/>
         <w:t>3. Market structure over time</w:t>
       </w:r>
     </w:p>
@@ -1009,7 +1017,11 @@
         <w:jc w:val="both"/>
       </w:pPr>
       <w:r>
-        <w:t>If holding more stocks is what makes a portfolio diversified, equal-weight and capitalization-weighted, which between them touch effectively the whole 500-stock universe every day, should be the most diversified methods in this study, and ERC, which explicitly equalizes risk contribution across names, should not be far behind. The evidence disagrees sharply (Table 1, Figure 3).</w:t>
+        <w:t xml:space="preserve">If holding more stocks is what makes a portfolio diversified, equal-weight and capitalization-weighted, which between them touch effectively the whole 500-stock universe every day, should be the most diversified methods in this study, and </w:t>
+      </w:r>
+      <w:r>
+        <w:lastRenderedPageBreak/>
+        <w:t>ERC, which explicitly equalizes risk contribution across names, should not be far behind. The evidence disagrees sharply (Table 1, Figure 3).</w:t>
       </w:r>
     </w:p>
     <w:p>
@@ -1021,7 +1033,6 @@
         <w:rPr>
           <w:noProof/>
         </w:rPr>
-        <w:lastRenderedPageBreak/>
         <w:drawing>
           <wp:inline distT="0" distB="0" distL="0" distR="0" wp14:anchorId="4D12ADB7" wp14:editId="609F2CE1">
             <wp:extent cx="6038850" cy="1485900"/>
@@ -2229,6 +2240,7 @@
         <w:jc w:val="both"/>
       </w:pPr>
       <w:r>
+        <w:lastRenderedPageBreak/>
         <w:t xml:space="preserve">ERC is the sharpest disagreement between intuition and evidence in this section. Equalizing dollar risk contribution across 500 names sounds like it should diversify away any single factor's dominance. But ERC's ENB (1.05) is barely different from </w:t>
       </w:r>
       <w:proofErr w:type="gramStart"/>
@@ -2237,11 +2249,7 @@
       </w:r>
       <w:proofErr w:type="gramEnd"/>
       <w:r>
-        <w:t xml:space="preserve"> (1.04). Making every stock contribute the same amount of risk does not diversify a portfolio across independent risk factors if every stock's risk comes from the same factor to begin with. Capitalization-weighted is </w:t>
-      </w:r>
-      <w:r>
-        <w:lastRenderedPageBreak/>
-        <w:t xml:space="preserve">the opposite surprise: despite becoming more concentrated in its largest holdings over the past several years, its diversification has </w:t>
+        <w:t xml:space="preserve"> (1.04). Making every stock contribute the same amount of risk does not diversify a portfolio across independent risk factors if every stock's risk comes from the same factor to begin with. Capitalization-weighted is the opposite surprise: despite becoming more concentrated in its largest holdings over the past several years, its diversification has </w:t>
       </w:r>
       <w:proofErr w:type="gramStart"/>
       <w:r>
@@ -4105,6 +4113,7 @@
                 <w:sz w:val="18"/>
                 <w:szCs w:val="18"/>
               </w:rPr>
+              <w:lastRenderedPageBreak/>
               <w:t>Equal-risk contribution</w:t>
             </w:r>
           </w:p>
@@ -4355,7 +4364,6 @@
         <w:rPr>
           <w:noProof/>
         </w:rPr>
-        <w:lastRenderedPageBreak/>
         <w:drawing>
           <wp:inline distT="0" distB="0" distL="0" distR="0" wp14:anchorId="1CBC9A2C" wp14:editId="0A734C39">
             <wp:extent cx="6400800" cy="2525395"/>
@@ -4478,7 +4486,11 @@
         <w:t xml:space="preserve">Tariff shock (2025). </w:t>
       </w:r>
       <w:r>
-        <w:t>As a single-day, exogenous policy announcement with a dateable reversal catalyst (the 9 April pause), the tariff shock is the cleanest natural experiment of the three, and the evidence matches that expectation closely: entropy-ENB for minimum variance and maximum diversification fell about 45% within a week of the 2 April announcement (Table 3), and minimum variance had not just recovered but overshot its pre-shock level within three weeks, the fastest full recovery of any episode studied. The one break from the naive-methods-stay-flat pattern established elsewhere in this report shows up here: cap-weight, ordinarily indistinguishable from equal-weight, fell 40%, comparable in magnitude to the optimized portfolios, because tariffs hit import-exposed sectors far harder than domestic services, adding real cross-sectional dispersion on top of a common shock.</w:t>
+        <w:t xml:space="preserve">As a single-day, exogenous policy announcement with a dateable reversal catalyst (the 9 April pause), the tariff shock is the cleanest natural experiment of the three, and the evidence matches that expectation closely: entropy-ENB for minimum variance and maximum diversification fell about 45% within a week of the 2 April announcement (Table 3), and minimum variance had not just recovered but overshot its pre-shock level within three weeks, the fastest full recovery of any episode studied. The one break from the naive-methods-stay-flat pattern established elsewhere in this report shows up here: cap-weight, ordinarily indistinguishable from equal-weight, fell 40%, comparable </w:t>
+      </w:r>
+      <w:r>
+        <w:lastRenderedPageBreak/>
+        <w:t>in magnitude to the optimized portfolios, because tariffs hit import-exposed sectors far harder than domestic services, adding real cross-sectional dispersion on top of a common shock.</w:t>
       </w:r>
     </w:p>
     <w:p>
@@ -4487,11 +4499,7 @@
         <w:jc w:val="both"/>
       </w:pPr>
       <w:r>
-        <w:t xml:space="preserve">Read together, the three episodes support the same conclusion from three different angles. Naive and risk-budgeted portfolios were never diversified to begin with, so no crisis, slow or fast, financial or exogenous, has much room to </w:t>
-      </w:r>
-      <w:r>
-        <w:lastRenderedPageBreak/>
-        <w:t xml:space="preserve">compress them further. The optimized portfolios' losses scale with how synchronized the underlying shock is, not with how long it lasts: COVID's few-week shock cut as deep as the GFC's year-long one. And cap-weight moved meaningfully only when a shock added genuine cross-sectional dispersion on top of a common factor (tariffs, and to a lesser extent COVID) rather than when it was purely a synchronized sell-everything event like the GFC. Diversification, measured this way, is not a fixed property of a portfolio; it is a claim that </w:t>
+        <w:t xml:space="preserve">Read together, the three episodes support the same conclusion from three different angles. Naive and risk-budgeted portfolios were never diversified to begin with, so no crisis, slow or fast, financial or exogenous, has much room to compress them further. The optimized portfolios' losses scale with how synchronized the underlying shock is, not with how long it lasts: COVID's few-week shock cut as deep as the GFC's year-long one. And cap-weight moved meaningfully only when a shock added genuine cross-sectional dispersion on top of a common factor (tariffs, and to a lesser extent COVID) rather than when it was purely a synchronized sell-everything event like the GFC. Diversification, measured this way, is not a fixed property of a portfolio; it is a claim that </w:t>
       </w:r>
       <w:r>
         <w:t>must</w:t>

</xml_diff>

<commit_message>
Corrections to the report
</commit_message>
<xml_diff>
--- a/docs/MarketStructure_Report.docx
+++ b/docs/MarketStructure_Report.docx
@@ -462,7 +462,7 @@
                     <pic:cNvPicPr/>
                   </pic:nvPicPr>
                   <pic:blipFill>
-                    <a:blip r:embed="rId7"/>
+                    <a:blip r:embed="rId8"/>
                     <a:stretch>
                       <a:fillRect/>
                     </a:stretch>
@@ -511,7 +511,7 @@
                     <pic:cNvPicPr/>
                   </pic:nvPicPr>
                   <pic:blipFill>
-                    <a:blip r:embed="rId8"/>
+                    <a:blip r:embed="rId9"/>
                     <a:stretch>
                       <a:fillRect/>
                     </a:stretch>
@@ -554,7 +554,7 @@
                     <pic:cNvPicPr/>
                   </pic:nvPicPr>
                   <pic:blipFill>
-                    <a:blip r:embed="rId9"/>
+                    <a:blip r:embed="rId10"/>
                     <a:stretch>
                       <a:fillRect/>
                     </a:stretch>
@@ -617,7 +617,7 @@
                     <pic:cNvPicPr/>
                   </pic:nvPicPr>
                   <pic:blipFill>
-                    <a:blip r:embed="rId10"/>
+                    <a:blip r:embed="rId11"/>
                     <a:stretch>
                       <a:fillRect/>
                     </a:stretch>
@@ -666,7 +666,7 @@
                     <pic:cNvPicPr/>
                   </pic:nvPicPr>
                   <pic:blipFill>
-                    <a:blip r:embed="rId11"/>
+                    <a:blip r:embed="rId12"/>
                     <a:stretch>
                       <a:fillRect/>
                     </a:stretch>
@@ -738,7 +738,7 @@
                     <pic:cNvPicPr/>
                   </pic:nvPicPr>
                   <pic:blipFill>
-                    <a:blip r:embed="rId12"/>
+                    <a:blip r:embed="rId13"/>
                     <a:stretch>
                       <a:fillRect/>
                     </a:stretch>
@@ -841,7 +841,19 @@
         <w:jc w:val="both"/>
       </w:pPr>
       <w:r>
-        <w:t>Average pairwise correlation among the largest names swings widely over the sample, from roughly 0.14 in the calmest stretches to 0.57 at the height of the GFC and euro-zone episodes (Figure 1). Correlation is the single best real-time barometer of market stress: it jumps almost discontinuously at each crisis marker and decays slowly afterwards.</w:t>
+        <w:t xml:space="preserve">Average pairwise correlation among the largest names swings widely over the sample, from roughly 0.14 in the calmest stretches to 0.57 at the height of the GFC and euro-zone episodes (Figure 1). Correlation is the single best real-time barometer of market stress: it </w:t>
+      </w:r>
+      <w:r>
+        <w:t>rises sharply</w:t>
+      </w:r>
+      <w:r>
+        <w:t xml:space="preserve"> </w:t>
+      </w:r>
+      <w:r>
+        <w:t>around several crisis periods</w:t>
+      </w:r>
+      <w:r>
+        <w:t xml:space="preserve"> and decays slowly afterwards.</w:t>
       </w:r>
     </w:p>
     <w:p>
@@ -869,7 +881,7 @@
                     <pic:cNvPicPr/>
                   </pic:nvPicPr>
                   <pic:blipFill>
-                    <a:blip r:embed="rId13"/>
+                    <a:blip r:embed="rId14"/>
                     <a:stretch>
                       <a:fillRect/>
                     </a:stretch>
@@ -959,7 +971,7 @@
                     <pic:cNvPicPr/>
                   </pic:nvPicPr>
                   <pic:blipFill>
-                    <a:blip r:embed="rId14"/>
+                    <a:blip r:embed="rId15"/>
                     <a:stretch>
                       <a:fillRect/>
                     </a:stretch>
@@ -1049,7 +1061,7 @@
                     <pic:cNvPicPr/>
                   </pic:nvPicPr>
                   <pic:blipFill>
-                    <a:blip r:embed="rId15"/>
+                    <a:blip r:embed="rId16"/>
                     <a:stretch>
                       <a:fillRect/>
                     </a:stretch>
@@ -1110,7 +1122,7 @@
                     <pic:cNvPicPr/>
                   </pic:nvPicPr>
                   <pic:blipFill>
-                    <a:blip r:embed="rId16"/>
+                    <a:blip r:embed="rId17"/>
                     <a:stretch>
                       <a:fillRect/>
                     </a:stretch>
@@ -2257,7 +2269,16 @@
       </w:r>
       <w:proofErr w:type="gramEnd"/>
       <w:r>
-        <w:t>. The likely explanation is compositional: the growing weight of AI-related and semiconductor names appears to have added a second, more specialized source of risk alongside the broad market factor, rather than simply doubling down on it.</w:t>
+        <w:t>. The likely explanation is compositional: the growing weight of AI-related and semiconductor names appears to have added a second, more specialized source of risk alongside the broad market factor, rather than simply doubling down on it</w:t>
+      </w:r>
+      <w:r>
+        <w:rPr>
+          <w:rStyle w:val="FootnoteReference"/>
+        </w:rPr>
+        <w:footnoteReference w:id="1"/>
+      </w:r>
+      <w:r>
+        <w:t>.</w:t>
       </w:r>
     </w:p>
     <w:p>
@@ -2289,7 +2310,16 @@
         <w:jc w:val="both"/>
       </w:pPr>
       <w:r>
-        <w:t>One period deserves an explicit caveat. Around May 2020, minimum variance's ENB spikes sharply upward right after the COVID crash, coinciding with its holdings count jumping from a small, concentrated set to nearly the full 500-stock universe (Appendix D). This looks less like a genuine diversification improvement than an artifact of the optimizer behaving erratically during an extreme, fast-moving regime shift. We return to this pattern with more care in Section 5. Full-sample figures in this section are not materially affected, but any single-day reading near that date should be treated with caution.</w:t>
+        <w:t>One period deserves an explicit caveat. Around May 2020, minimum variance's ENB spikes sharply upward right after the COVID crash, coinciding with its holdings count jumping from a small, concentrated set to nearly the full 500-stock universe (Appendix D). This looks less like a genuine diversification improvement than an artifact of the optimizer behaving erratically during an extreme, fast-moving regime shift</w:t>
+      </w:r>
+      <w:r>
+        <w:rPr>
+          <w:rStyle w:val="FootnoteReference"/>
+        </w:rPr>
+        <w:footnoteReference w:id="2"/>
+      </w:r>
+      <w:r>
+        <w:t>. We return to this pattern with more care in Section 5. Full-sample figures in this section are not materially affected, but any single-day reading near that date should be treated with caution.</w:t>
       </w:r>
     </w:p>
     <w:p>
@@ -3591,6 +3621,7 @@
                 <w:sz w:val="18"/>
                 <w:szCs w:val="18"/>
               </w:rPr>
+              <w:lastRenderedPageBreak/>
               <w:t>Portfolio</w:t>
             </w:r>
           </w:p>
@@ -4113,7 +4144,6 @@
                 <w:sz w:val="18"/>
                 <w:szCs w:val="18"/>
               </w:rPr>
-              <w:lastRenderedPageBreak/>
               <w:t>Equal-risk contribution</w:t>
             </w:r>
           </w:p>
@@ -4380,7 +4410,7 @@
                     <pic:cNvPicPr/>
                   </pic:nvPicPr>
                   <pic:blipFill>
-                    <a:blip r:embed="rId17"/>
+                    <a:blip r:embed="rId18"/>
                     <a:stretch>
                       <a:fillRect/>
                     </a:stretch>
@@ -4445,7 +4475,22 @@
         <w:t>higher</w:t>
       </w:r>
       <w:r>
-        <w:t xml:space="preserve"> than in calm 2006 (9.1 vs. 7.9), because financials were cracking while energy and commodities kept rallying. Heterogeneous stress, not synchronized stress, leaves the optimizer plenty of room to diversify. The break, when it came, was sudden and severe: entropy-ENB for minimum variance and maximum diversification fell 74% and 55% respectively in the six weeks around Lehman's 15 September bankruptcy (Table 3), and unlike the other two episodes, neither portfolio had recovered even half its pre-crisis level three months later (Figure 5). The absorption ratio kept climbing for nearly three months after Lehman, and the minimum-variance optimizer's holdings followed the same delayed pattern, bottoming at just 13 names in late December. The GFC's damage was not only the deepest of the three episodes, but the only one that hadn't started healing by the end of its own acute window.</w:t>
+        <w:t xml:space="preserve"> than in calm 2006 (9.1 vs. 7.9), because financials were cracking while energy and commodities kept rallying. Heterogeneous stress, not synchronized stress, leaves the optimizer plenty of room to diversify</w:t>
+      </w:r>
+      <w:r>
+        <w:rPr>
+          <w:rStyle w:val="FootnoteReference"/>
+        </w:rPr>
+        <w:footnoteReference w:id="3"/>
+      </w:r>
+      <w:r>
+        <w:t xml:space="preserve">. The break, when it came, was sudden and severe: entropy-ENB for minimum variance and maximum diversification fell 74% and 55% respectively in the six weeks around Lehman's 15 September bankruptcy (Table 3), and unlike the other two episodes, neither portfolio had recovered even half its pre-crisis level three months later (Figure 5). The absorption ratio kept climbing for nearly three months after Lehman, and the minimum-variance optimizer's holdings followed the same delayed pattern, bottoming at just 13 names in </w:t>
+      </w:r>
+      <w:r>
+        <w:t>early</w:t>
+      </w:r>
+      <w:r>
+        <w:t xml:space="preserve"> December. The GFC's damage was not only the deepest of the three episodes, but the only one that hadn't started healing by the end of its own acute window.</w:t>
       </w:r>
     </w:p>
     <w:p>
@@ -4461,13 +4506,31 @@
         <w:t xml:space="preserve">COVID-19 (2020). </w:t>
       </w:r>
       <w:r>
-        <w:t xml:space="preserve">As a fast, exogenous shock, COVID should behave more like the tariff episode than the GFC, and the onset does: minimum variance's ENB reached its trough just three trading days after the WHO's 11 March pandemic declaration, and the absorption ratio's own peak landed almost exactly on the market's 23 March bottom. The analogy breaks down on depth and recovery, however. The collapse was GFC-deep (entropy-ENB fell 70% and 71% for minimum variance and maximum diversification, Table 3) rather than tariff-shallow, and </w:t>
+        <w:t xml:space="preserve">As a fast, exogenous shock, COVID should behave more like the tariff episode than the GFC, and the onset does: minimum variance's ENB reached its trough just three trading days after the WHO's 11 March pandemic declaration, and the absorption ratio's own peak landed </w:t>
+      </w:r>
+      <w:r>
+        <w:t>very close to</w:t>
+      </w:r>
+      <w:r>
+        <w:t xml:space="preserve"> the market's 23 March bottom</w:t>
+      </w:r>
+      <w:r>
+        <w:t>, on March 26</w:t>
+      </w:r>
+      <w:r>
+        <w:t xml:space="preserve">. The analogy breaks down on depth and recovery, however. The collapse was GFC-deep (entropy-ENB fell 70% and 71% for minimum variance and maximum diversification, Table 3) rather than tariff-shallow, and </w:t>
       </w:r>
       <w:r>
         <w:t>m</w:t>
       </w:r>
       <w:r>
-        <w:t>inimum variance's rebound overshot dramatically, climbing to 5.7x its pre-crash level by day 54 before dropping back to around 1.8x by the third month (Figure 5), as the optimizer resettled into a smaller, differently-composed set of holdings than it held before the crash</w:t>
+        <w:t xml:space="preserve">inimum variance's rebound overshot dramatically, climbing to 5.7x </w:t>
+      </w:r>
+      <w:r>
+        <w:t xml:space="preserve">the declaration date </w:t>
+      </w:r>
+      <w:r>
+        <w:t>level by day 54 before dropping back to around 1.8x by the third month (Figure 5), as the optimizer resettled into a smaller, differently-composed set of holdings than it held before the crash</w:t>
       </w:r>
       <w:r>
         <w:t>. Cap-weight, largely inert in the tariff shock, fell a real 17% here. COVID combines the GFC's depth with the tariff shock's speed: a collapse as severe as the slowest episode studied, resolved as fast as the quickest.</w:t>
@@ -4483,14 +4546,11 @@
           <w:b/>
           <w:bCs/>
         </w:rPr>
+        <w:lastRenderedPageBreak/>
         <w:t xml:space="preserve">Tariff shock (2025). </w:t>
       </w:r>
       <w:r>
-        <w:t xml:space="preserve">As a single-day, exogenous policy announcement with a dateable reversal catalyst (the 9 April pause), the tariff shock is the cleanest natural experiment of the three, and the evidence matches that expectation closely: entropy-ENB for minimum variance and maximum diversification fell about 45% within a week of the 2 April announcement (Table 3), and minimum variance had not just recovered but overshot its pre-shock level within three weeks, the fastest full recovery of any episode studied. The one break from the naive-methods-stay-flat pattern established elsewhere in this report shows up here: cap-weight, ordinarily indistinguishable from equal-weight, fell 40%, comparable </w:t>
-      </w:r>
-      <w:r>
-        <w:lastRenderedPageBreak/>
-        <w:t>in magnitude to the optimized portfolios, because tariffs hit import-exposed sectors far harder than domestic services, adding real cross-sectional dispersion on top of a common shock.</w:t>
+        <w:t>As a single-day, exogenous policy announcement with a dateable reversal catalyst (the 9 April pause), the tariff shock is the cleanest natural experiment of the three, and the evidence matches that expectation closely: entropy-ENB for minimum variance and maximum diversification fell about 45% within a week of the 2 April announcement (Table 3), and minimum variance had not just recovered but overshot its pre-shock level within three weeks, the fastest full recovery of any episode studied. The one break from the naive-methods-stay-flat pattern established elsewhere in this report shows up here: cap-weight, ordinarily indistinguishable from equal-weight, fell 40%, comparable in magnitude to the optimized portfolios.</w:t>
       </w:r>
     </w:p>
     <w:p>
@@ -4530,7 +4590,13 @@
         <w:jc w:val="both"/>
       </w:pPr>
       <w:r>
-        <w:t>Viewed through PCA, the five construction methods split cleanly into two groups. The covariance-optimized methods (minimum variance, maximum diversification) hold roughly 5–6 effective bets across the full sample by actively tilting away from the dominant market factor; the naive and risk-budgeted methods (equal-weight, capitalization-weighted, ERC) hold barely more than one, because equal-dollar or equal-risk weighting still leaves the portfolio dominated by PC1 regardless of how many names it holds. Diversification, by this measure, is not a static property of a construction method: it is strongly pro-cyclical, compressing in every stress regime studied and rebuilding in calm markets.</w:t>
+        <w:t xml:space="preserve">Viewed through PCA, the five construction methods split cleanly into two groups. The covariance-optimized methods (minimum variance, maximum diversification) hold roughly 5–6 effective bets across the full sample by actively tilting away from the dominant market factor; the naive and risk-budgeted methods (equal-weight, capitalization-weighted, ERC) hold barely more than one, because equal-dollar or equal-risk weighting still leaves the portfolio dominated by PC1 regardless of how many names it holds. Diversification, by this measure, is not a static property of a construction method: it is strongly pro-cyclical, compressing in </w:t>
+      </w:r>
+      <w:r>
+        <w:t xml:space="preserve">each of the three detailed crisis episodes studied </w:t>
+      </w:r>
+      <w:r>
+        <w:t>and rebuilding in calm markets.</w:t>
       </w:r>
     </w:p>
     <w:p>
@@ -4563,6 +4629,10 @@
       <w:pPr>
         <w:pageBreakBefore/>
       </w:pPr>
+      <w:r>
+        <w:lastRenderedPageBreak/>
+        <w:t>Minimum</w:t>
+      </w:r>
     </w:p>
     <w:p>
       <w:pPr>
@@ -5416,7 +5486,7 @@
                     <pic:cNvPicPr/>
                   </pic:nvPicPr>
                   <pic:blipFill>
-                    <a:blip r:embed="rId18"/>
+                    <a:blip r:embed="rId19"/>
                     <a:stretch>
                       <a:fillRect/>
                     </a:stretch>
@@ -5465,7 +5535,7 @@
                     <pic:cNvPicPr/>
                   </pic:nvPicPr>
                   <pic:blipFill>
-                    <a:blip r:embed="rId19"/>
+                    <a:blip r:embed="rId20"/>
                     <a:stretch>
                       <a:fillRect/>
                     </a:stretch>
@@ -5505,49 +5575,6 @@
                 <pic:pic xmlns:pic="http://schemas.openxmlformats.org/drawingml/2006/picture">
                   <pic:nvPicPr>
                     <pic:cNvPr id="100013" name="image100013"/>
-                    <pic:cNvPicPr/>
-                  </pic:nvPicPr>
-                  <pic:blipFill>
-                    <a:blip r:embed="rId20"/>
-                    <a:stretch>
-                      <a:fillRect/>
-                    </a:stretch>
-                  </pic:blipFill>
-                  <pic:spPr>
-                    <a:xfrm>
-                      <a:off x="0" y="0"/>
-                      <a:ext cx="104775" cy="142875"/>
-                    </a:xfrm>
-                    <a:prstGeom prst="rect">
-                      <a:avLst/>
-                    </a:prstGeom>
-                  </pic:spPr>
-                </pic:pic>
-              </a:graphicData>
-            </a:graphic>
-          </wp:inline>
-        </w:drawing>
-      </w:r>
-      <w:r>
-        <w:t xml:space="preserve"> is the vector of weights, and </w:t>
-      </w:r>
-      <w:r>
-        <w:rPr>
-          <w:noProof/>
-        </w:rPr>
-        <w:drawing>
-          <wp:inline distT="0" distB="0" distL="0" distR="0" wp14:anchorId="3E8E08C6" wp14:editId="69F37290">
-            <wp:extent cx="104775" cy="142875"/>
-            <wp:effectExtent l="0" t="0" r="0" b="0"/>
-            <wp:docPr id="100014" name="Picture 100014"/>
-            <wp:cNvGraphicFramePr>
-              <a:graphicFrameLocks xmlns:a="http://schemas.openxmlformats.org/drawingml/2006/main" noChangeAspect="1"/>
-            </wp:cNvGraphicFramePr>
-            <a:graphic xmlns:a="http://schemas.openxmlformats.org/drawingml/2006/main">
-              <a:graphicData uri="http://schemas.openxmlformats.org/drawingml/2006/picture">
-                <pic:pic xmlns:pic="http://schemas.openxmlformats.org/drawingml/2006/picture">
-                  <pic:nvPicPr>
-                    <pic:cNvPr id="100014" name="image100014"/>
                     <pic:cNvPicPr/>
                   </pic:nvPicPr>
                   <pic:blipFill>
@@ -5572,6 +5599,49 @@
         </w:drawing>
       </w:r>
       <w:r>
+        <w:t xml:space="preserve"> is the vector of weights, and </w:t>
+      </w:r>
+      <w:r>
+        <w:rPr>
+          <w:noProof/>
+        </w:rPr>
+        <w:drawing>
+          <wp:inline distT="0" distB="0" distL="0" distR="0" wp14:anchorId="3E8E08C6" wp14:editId="69F37290">
+            <wp:extent cx="104775" cy="142875"/>
+            <wp:effectExtent l="0" t="0" r="0" b="0"/>
+            <wp:docPr id="100014" name="Picture 100014"/>
+            <wp:cNvGraphicFramePr>
+              <a:graphicFrameLocks xmlns:a="http://schemas.openxmlformats.org/drawingml/2006/main" noChangeAspect="1"/>
+            </wp:cNvGraphicFramePr>
+            <a:graphic xmlns:a="http://schemas.openxmlformats.org/drawingml/2006/main">
+              <a:graphicData uri="http://schemas.openxmlformats.org/drawingml/2006/picture">
+                <pic:pic xmlns:pic="http://schemas.openxmlformats.org/drawingml/2006/picture">
+                  <pic:nvPicPr>
+                    <pic:cNvPr id="100014" name="image100014"/>
+                    <pic:cNvPicPr/>
+                  </pic:nvPicPr>
+                  <pic:blipFill>
+                    <a:blip r:embed="rId22"/>
+                    <a:stretch>
+                      <a:fillRect/>
+                    </a:stretch>
+                  </pic:blipFill>
+                  <pic:spPr>
+                    <a:xfrm>
+                      <a:off x="0" y="0"/>
+                      <a:ext cx="104775" cy="142875"/>
+                    </a:xfrm>
+                    <a:prstGeom prst="rect">
+                      <a:avLst/>
+                    </a:prstGeom>
+                  </pic:spPr>
+                </pic:pic>
+              </a:graphicData>
+            </a:graphic>
+          </wp:inline>
+        </w:drawing>
+      </w:r>
+      <w:r>
         <w:t xml:space="preserve"> is the raw covariance matrix.</w:t>
       </w:r>
     </w:p>
@@ -5610,7 +5680,7 @@
                     <pic:cNvPicPr/>
                   </pic:nvPicPr>
                   <pic:blipFill>
-                    <a:blip r:embed="rId22"/>
+                    <a:blip r:embed="rId23"/>
                     <a:stretch>
                       <a:fillRect/>
                     </a:stretch>
@@ -5659,7 +5729,7 @@
                     <pic:cNvPicPr/>
                   </pic:nvPicPr>
                   <pic:blipFill>
-                    <a:blip r:embed="rId23"/>
+                    <a:blip r:embed="rId24"/>
                     <a:stretch>
                       <a:fillRect/>
                     </a:stretch>
@@ -5702,7 +5772,7 @@
                     <pic:cNvPicPr/>
                   </pic:nvPicPr>
                   <pic:blipFill>
-                    <a:blip r:embed="rId24"/>
+                    <a:blip r:embed="rId25"/>
                     <a:stretch>
                       <a:fillRect/>
                     </a:stretch>
@@ -5761,7 +5831,7 @@
                     <pic:cNvPicPr/>
                   </pic:nvPicPr>
                   <pic:blipFill>
-                    <a:blip r:embed="rId25"/>
+                    <a:blip r:embed="rId26"/>
                     <a:stretch>
                       <a:fillRect/>
                     </a:stretch>
@@ -5810,7 +5880,7 @@
                     <pic:cNvPicPr/>
                   </pic:nvPicPr>
                   <pic:blipFill>
-                    <a:blip r:embed="rId26"/>
+                    <a:blip r:embed="rId27"/>
                     <a:stretch>
                       <a:fillRect/>
                     </a:stretch>
@@ -5853,7 +5923,7 @@
                     <pic:cNvPicPr/>
                   </pic:nvPicPr>
                   <pic:blipFill>
-                    <a:blip r:embed="rId27"/>
+                    <a:blip r:embed="rId28"/>
                     <a:stretch>
                       <a:fillRect/>
                     </a:stretch>
@@ -5905,7 +5975,7 @@
                     <pic:cNvPicPr/>
                   </pic:nvPicPr>
                   <pic:blipFill>
-                    <a:blip r:embed="rId28"/>
+                    <a:blip r:embed="rId29"/>
                     <a:stretch>
                       <a:fillRect/>
                     </a:stretch>
@@ -5948,7 +6018,7 @@
                     <pic:cNvPicPr/>
                   </pic:nvPicPr>
                   <pic:blipFill>
-                    <a:blip r:embed="rId29"/>
+                    <a:blip r:embed="rId30"/>
                     <a:stretch>
                       <a:fillRect/>
                     </a:stretch>
@@ -5991,7 +6061,7 @@
                     <pic:cNvPicPr/>
                   </pic:nvPicPr>
                   <pic:blipFill>
-                    <a:blip r:embed="rId30"/>
+                    <a:blip r:embed="rId31"/>
                     <a:stretch>
                       <a:fillRect/>
                     </a:stretch>
@@ -6034,7 +6104,7 @@
                     <pic:cNvPicPr/>
                   </pic:nvPicPr>
                   <pic:blipFill>
-                    <a:blip r:embed="rId31"/>
+                    <a:blip r:embed="rId32"/>
                     <a:stretch>
                       <a:fillRect/>
                     </a:stretch>
@@ -6094,7 +6164,7 @@
                     <pic:cNvPicPr/>
                   </pic:nvPicPr>
                   <pic:blipFill>
-                    <a:blip r:embed="rId32"/>
+                    <a:blip r:embed="rId33"/>
                     <a:stretch>
                       <a:fillRect/>
                     </a:stretch>
@@ -6156,7 +6226,7 @@
                     <pic:cNvPicPr/>
                   </pic:nvPicPr>
                   <pic:blipFill>
-                    <a:blip r:embed="rId33"/>
+                    <a:blip r:embed="rId34"/>
                     <a:stretch>
                       <a:fillRect/>
                     </a:stretch>
@@ -6205,7 +6275,7 @@
                     <pic:cNvPicPr/>
                   </pic:nvPicPr>
                   <pic:blipFill>
-                    <a:blip r:embed="rId34"/>
+                    <a:blip r:embed="rId35"/>
                     <a:stretch>
                       <a:fillRect/>
                     </a:stretch>
@@ -6248,7 +6318,7 @@
                     <pic:cNvPicPr/>
                   </pic:nvPicPr>
                   <pic:blipFill>
-                    <a:blip r:embed="rId35"/>
+                    <a:blip r:embed="rId36"/>
                     <a:stretch>
                       <a:fillRect/>
                     </a:stretch>
@@ -6307,7 +6377,7 @@
                     <pic:cNvPicPr/>
                   </pic:nvPicPr>
                   <pic:blipFill>
-                    <a:blip r:embed="rId36"/>
+                    <a:blip r:embed="rId37"/>
                     <a:stretch>
                       <a:fillRect/>
                     </a:stretch>
@@ -6356,7 +6426,7 @@
                     <pic:cNvPicPr/>
                   </pic:nvPicPr>
                   <pic:blipFill>
-                    <a:blip r:embed="rId37"/>
+                    <a:blip r:embed="rId38"/>
                     <a:stretch>
                       <a:fillRect/>
                     </a:stretch>
@@ -6399,7 +6469,7 @@
                     <pic:cNvPicPr/>
                   </pic:nvPicPr>
                   <pic:blipFill>
-                    <a:blip r:embed="rId38"/>
+                    <a:blip r:embed="rId39"/>
                     <a:stretch>
                       <a:fillRect/>
                     </a:stretch>
@@ -6449,7 +6519,7 @@
                     <pic:cNvPicPr/>
                   </pic:nvPicPr>
                   <pic:blipFill>
-                    <a:blip r:embed="rId39"/>
+                    <a:blip r:embed="rId40"/>
                     <a:stretch>
                       <a:fillRect/>
                     </a:stretch>
@@ -6498,7 +6568,7 @@
                     <pic:cNvPicPr/>
                   </pic:nvPicPr>
                   <pic:blipFill>
-                    <a:blip r:embed="rId40"/>
+                    <a:blip r:embed="rId41"/>
                     <a:stretch>
                       <a:fillRect/>
                     </a:stretch>
@@ -6541,7 +6611,7 @@
                     <pic:cNvPicPr/>
                   </pic:nvPicPr>
                   <pic:blipFill>
-                    <a:blip r:embed="rId41"/>
+                    <a:blip r:embed="rId42"/>
                     <a:stretch>
                       <a:fillRect/>
                     </a:stretch>
@@ -6584,7 +6654,7 @@
                     <pic:cNvPicPr/>
                   </pic:nvPicPr>
                   <pic:blipFill>
-                    <a:blip r:embed="rId42"/>
+                    <a:blip r:embed="rId43"/>
                     <a:stretch>
                       <a:fillRect/>
                     </a:stretch>
@@ -6643,7 +6713,7 @@
                     <pic:cNvPicPr/>
                   </pic:nvPicPr>
                   <pic:blipFill>
-                    <a:blip r:embed="rId43"/>
+                    <a:blip r:embed="rId44"/>
                     <a:stretch>
                       <a:fillRect/>
                     </a:stretch>
@@ -6692,7 +6762,7 @@
                     <pic:cNvPicPr/>
                   </pic:nvPicPr>
                   <pic:blipFill>
-                    <a:blip r:embed="rId44"/>
+                    <a:blip r:embed="rId45"/>
                     <a:stretch>
                       <a:fillRect/>
                     </a:stretch>
@@ -7957,7 +8027,7 @@
                     <pic:cNvPicPr/>
                   </pic:nvPicPr>
                   <pic:blipFill>
-                    <a:blip r:embed="rId45"/>
+                    <a:blip r:embed="rId46"/>
                     <a:stretch>
                       <a:fillRect/>
                     </a:stretch>
@@ -8019,7 +8089,7 @@
                     <pic:cNvPicPr/>
                   </pic:nvPicPr>
                   <pic:blipFill>
-                    <a:blip r:embed="rId46"/>
+                    <a:blip r:embed="rId47"/>
                     <a:stretch>
                       <a:fillRect/>
                     </a:stretch>
@@ -8080,7 +8150,7 @@
                     <pic:cNvPicPr/>
                   </pic:nvPicPr>
                   <pic:blipFill>
-                    <a:blip r:embed="rId47"/>
+                    <a:blip r:embed="rId48"/>
                     <a:stretch>
                       <a:fillRect/>
                     </a:stretch>
@@ -8141,7 +8211,7 @@
                     <pic:cNvPicPr/>
                   </pic:nvPicPr>
                   <pic:blipFill>
-                    <a:blip r:embed="rId48"/>
+                    <a:blip r:embed="rId49"/>
                     <a:stretch>
                       <a:fillRect/>
                     </a:stretch>
@@ -8223,7 +8293,7 @@
                     <pic:cNvPicPr/>
                   </pic:nvPicPr>
                   <pic:blipFill>
-                    <a:blip r:embed="rId49"/>
+                    <a:blip r:embed="rId50"/>
                     <a:stretch>
                       <a:fillRect/>
                     </a:stretch>
@@ -8284,7 +8354,7 @@
                     <pic:cNvPicPr/>
                   </pic:nvPicPr>
                   <pic:blipFill>
-                    <a:blip r:embed="rId50"/>
+                    <a:blip r:embed="rId51"/>
                     <a:stretch>
                       <a:fillRect/>
                     </a:stretch>
@@ -8346,7 +8416,7 @@
                     <pic:cNvPicPr/>
                   </pic:nvPicPr>
                   <pic:blipFill>
-                    <a:blip r:embed="rId51"/>
+                    <a:blip r:embed="rId52"/>
                     <a:stretch>
                       <a:fillRect/>
                     </a:stretch>
@@ -8407,7 +8477,7 @@
                     <pic:cNvPicPr/>
                   </pic:nvPicPr>
                   <pic:blipFill>
-                    <a:blip r:embed="rId52"/>
+                    <a:blip r:embed="rId53"/>
                     <a:stretch>
                       <a:fillRect/>
                     </a:stretch>
@@ -8489,7 +8559,7 @@
                     <pic:cNvPicPr/>
                   </pic:nvPicPr>
                   <pic:blipFill>
-                    <a:blip r:embed="rId53"/>
+                    <a:blip r:embed="rId54"/>
                     <a:stretch>
                       <a:fillRect/>
                     </a:stretch>
@@ -8550,7 +8620,7 @@
                     <pic:cNvPicPr/>
                   </pic:nvPicPr>
                   <pic:blipFill>
-                    <a:blip r:embed="rId54"/>
+                    <a:blip r:embed="rId55"/>
                     <a:stretch>
                       <a:fillRect/>
                     </a:stretch>
@@ -8612,7 +8682,7 @@
                     <pic:cNvPicPr/>
                   </pic:nvPicPr>
                   <pic:blipFill>
-                    <a:blip r:embed="rId55"/>
+                    <a:blip r:embed="rId56"/>
                     <a:stretch>
                       <a:fillRect/>
                     </a:stretch>
@@ -8673,7 +8743,7 @@
                     <pic:cNvPicPr/>
                   </pic:nvPicPr>
                   <pic:blipFill>
-                    <a:blip r:embed="rId56"/>
+                    <a:blip r:embed="rId57"/>
                     <a:stretch>
                       <a:fillRect/>
                     </a:stretch>
@@ -8802,7 +8872,7 @@
       </w:r>
     </w:p>
     <w:sectPr>
-      <w:footerReference w:type="default" r:id="rId57"/>
+      <w:footerReference w:type="default" r:id="rId58"/>
       <w:pgSz w:w="12240" w:h="15840"/>
       <w:pgMar w:top="1080" w:right="1080" w:bottom="1080" w:left="1080" w:header="708" w:footer="708" w:gutter="0"/>
       <w:cols w:space="720"/>
@@ -8952,6 +9022,150 @@
     <w:p>
       <w:r>
         <w:continuationSeparator/>
+      </w:r>
+    </w:p>
+  </w:footnote>
+  <w:footnote w:id="1">
+    <w:p>
+      <w:pPr>
+        <w:pStyle w:val="FootnoteText"/>
+      </w:pPr>
+      <w:r>
+        <w:rPr>
+          <w:rStyle w:val="FootnoteReference"/>
+        </w:rPr>
+        <w:footnoteRef/>
+      </w:r>
+      <w:r>
+        <w:t xml:space="preserve"> </w:t>
+      </w:r>
+      <w:r>
+        <w:rPr>
+          <w:b/>
+          <w:bCs/>
+        </w:rPr>
+        <w:t>Interpretive statement</w:t>
+      </w:r>
+      <w:r>
+        <w:rPr>
+          <w:b/>
+          <w:bCs/>
+        </w:rPr>
+        <w:t xml:space="preserve">. </w:t>
+      </w:r>
+      <w:r>
+        <w:t>Consistent with empirical pattern but is not directly tested or quantitatively identified in the notebook.</w:t>
+      </w:r>
+    </w:p>
+  </w:footnote>
+  <w:footnote w:id="2">
+    <w:p>
+      <w:pPr>
+        <w:pStyle w:val="FootnoteText"/>
+      </w:pPr>
+      <w:r>
+        <w:rPr>
+          <w:rStyle w:val="FootnoteReference"/>
+        </w:rPr>
+        <w:footnoteRef/>
+      </w:r>
+      <w:r>
+        <w:t xml:space="preserve"> </w:t>
+      </w:r>
+      <w:r>
+        <w:rPr>
+          <w:b/>
+          <w:bCs/>
+        </w:rPr>
+        <w:t>Interpretive statement</w:t>
+      </w:r>
+      <w:r>
+        <w:t xml:space="preserve">. </w:t>
+      </w:r>
+      <w:r>
+        <w:t>The proposed explanation of the o</w:t>
+      </w:r>
+      <w:r>
+        <w:t>ptimizer</w:t>
+      </w:r>
+      <w:r>
+        <w:t>’s</w:t>
+      </w:r>
+      <w:r>
+        <w:t xml:space="preserve"> behavior</w:t>
+      </w:r>
+      <w:r>
+        <w:t xml:space="preserve"> is not directly tested or </w:t>
+      </w:r>
+      <w:r>
+        <w:t>causally identified</w:t>
+      </w:r>
+      <w:r>
+        <w:rPr>
+          <w:b/>
+          <w:bCs/>
+        </w:rPr>
+        <w:t xml:space="preserve"> </w:t>
+      </w:r>
+      <w:r>
+        <w:t>in the analysis.</w:t>
+      </w:r>
+    </w:p>
+  </w:footnote>
+  <w:footnote w:id="3">
+    <w:p>
+      <w:pPr>
+        <w:pStyle w:val="FootnoteText"/>
+      </w:pPr>
+      <w:r>
+        <w:rPr>
+          <w:rStyle w:val="FootnoteReference"/>
+        </w:rPr>
+        <w:footnoteRef/>
+      </w:r>
+      <w:r>
+        <w:t xml:space="preserve"> </w:t>
+      </w:r>
+      <w:r>
+        <w:rPr>
+          <w:b/>
+          <w:bCs/>
+        </w:rPr>
+        <w:t>Interpretive statement</w:t>
+      </w:r>
+      <w:r>
+        <w:t xml:space="preserve">. </w:t>
+      </w:r>
+      <w:r>
+        <w:t>The proposed explanation of the o</w:t>
+      </w:r>
+      <w:r>
+        <w:t>ptimizer</w:t>
+      </w:r>
+      <w:r>
+        <w:t>’s</w:t>
+      </w:r>
+      <w:r>
+        <w:t xml:space="preserve"> behavior</w:t>
+      </w:r>
+      <w:r>
+        <w:t xml:space="preserve"> </w:t>
+      </w:r>
+      <w:r>
+        <w:t xml:space="preserve">is not directly tested or </w:t>
+      </w:r>
+      <w:r>
+        <w:t>causally identified</w:t>
+      </w:r>
+      <w:r>
+        <w:rPr>
+          <w:b/>
+          <w:bCs/>
+        </w:rPr>
+        <w:t xml:space="preserve"> </w:t>
+      </w:r>
+      <w:r>
+        <w:t>in the analysis.</w:t>
       </w:r>
     </w:p>
   </w:footnote>
@@ -9653,6 +9867,59 @@
       <w:szCs w:val="20"/>
     </w:rPr>
   </w:style>
+  <w:style w:type="paragraph" w:styleId="Header">
+    <w:name w:val="header"/>
+    <w:basedOn w:val="Normal"/>
+    <w:link w:val="HeaderChar"/>
+    <w:uiPriority w:val="99"/>
+    <w:unhideWhenUsed/>
+    <w:rsid w:val="00A67196"/>
+    <w:pPr>
+      <w:tabs>
+        <w:tab w:val="center" w:pos="4680"/>
+        <w:tab w:val="right" w:pos="9360"/>
+      </w:tabs>
+    </w:pPr>
+  </w:style>
+  <w:style w:type="character" w:customStyle="1" w:styleId="HeaderChar">
+    <w:name w:val="Header Char"/>
+    <w:basedOn w:val="DefaultParagraphFont"/>
+    <w:link w:val="Header"/>
+    <w:uiPriority w:val="99"/>
+    <w:rsid w:val="00A67196"/>
+  </w:style>
+  <w:style w:type="paragraph" w:styleId="Footer">
+    <w:name w:val="footer"/>
+    <w:basedOn w:val="Normal"/>
+    <w:link w:val="FooterChar"/>
+    <w:uiPriority w:val="99"/>
+    <w:unhideWhenUsed/>
+    <w:rsid w:val="00A67196"/>
+    <w:pPr>
+      <w:tabs>
+        <w:tab w:val="center" w:pos="4680"/>
+        <w:tab w:val="right" w:pos="9360"/>
+      </w:tabs>
+    </w:pPr>
+  </w:style>
+  <w:style w:type="character" w:customStyle="1" w:styleId="FooterChar">
+    <w:name w:val="Footer Char"/>
+    <w:basedOn w:val="DefaultParagraphFont"/>
+    <w:link w:val="Footer"/>
+    <w:uiPriority w:val="99"/>
+    <w:rsid w:val="00A67196"/>
+  </w:style>
+  <w:style w:type="character" w:styleId="Strong">
+    <w:name w:val="Strong"/>
+    <w:basedOn w:val="DefaultParagraphFont"/>
+    <w:uiPriority w:val="22"/>
+    <w:qFormat/>
+    <w:rsid w:val="00B47F70"/>
+    <w:rPr>
+      <w:b/>
+      <w:bCs/>
+    </w:rPr>
+  </w:style>
 </w:styles>
 </file>
 
@@ -9969,4 +10236,16 @@
     </a:ext>
   </a:extLst>
 </a:theme>
+</file>
+
+<file path=customXml/item1.xml><?xml version="1.0" encoding="utf-8"?>
+<b:Sources xmlns:b="http://schemas.openxmlformats.org/officeDocument/2006/bibliography" xmlns="http://schemas.openxmlformats.org/officeDocument/2006/bibliography" SelectedStyle="/APASixthEditionOfficeOnline.xsl" StyleName="APA" Version="6"/>
+</file>
+
+<file path=customXml/itemProps1.xml><?xml version="1.0" encoding="utf-8"?>
+<ds:datastoreItem xmlns:ds="http://schemas.openxmlformats.org/officeDocument/2006/customXml" ds:itemID="{5E6270B3-4CCD-004B-BF73-92C0EFFF9ED7}">
+  <ds:schemaRefs>
+    <ds:schemaRef ds:uri="http://schemas.openxmlformats.org/officeDocument/2006/bibliography"/>
+  </ds:schemaRefs>
+</ds:datastoreItem>
 </file>
</xml_diff>

<commit_message>
Correction to Appendix A typo
</commit_message>
<xml_diff>
--- a/docs/MarketStructure_Report.docx
+++ b/docs/MarketStructure_Report.docx
@@ -4627,19 +4627,8 @@
     </w:p>
     <w:p>
       <w:pPr>
-        <w:pageBreakBefore/>
-      </w:pPr>
-      <w:r>
-        <w:lastRenderedPageBreak/>
-        <w:t>Minimum</w:t>
-      </w:r>
-    </w:p>
-    <w:p>
-      <w:pPr>
         <w:pStyle w:val="Heading1"/>
         <w:spacing w:before="260" w:after="120"/>
-      </w:pPr>
-      <w:r>
         <w:rPr>
           <w:b/>
           <w:bCs/>
@@ -4647,6 +4636,74 @@
           <w:sz w:val="27"/>
           <w:szCs w:val="27"/>
         </w:rPr>
+      </w:pPr>
+    </w:p>
+    <w:p>
+      <w:pPr>
+        <w:pStyle w:val="Heading1"/>
+        <w:spacing w:before="260" w:after="120"/>
+        <w:rPr>
+          <w:b/>
+          <w:bCs/>
+          <w:color w:val="000000"/>
+          <w:sz w:val="27"/>
+          <w:szCs w:val="27"/>
+        </w:rPr>
+      </w:pPr>
+    </w:p>
+    <w:p>
+      <w:pPr>
+        <w:pStyle w:val="Heading1"/>
+        <w:spacing w:before="260" w:after="120"/>
+        <w:rPr>
+          <w:b/>
+          <w:bCs/>
+          <w:color w:val="000000"/>
+          <w:sz w:val="27"/>
+          <w:szCs w:val="27"/>
+        </w:rPr>
+      </w:pPr>
+    </w:p>
+    <w:p>
+      <w:pPr>
+        <w:pStyle w:val="Heading1"/>
+        <w:spacing w:before="260" w:after="120"/>
+        <w:rPr>
+          <w:b/>
+          <w:bCs/>
+          <w:color w:val="000000"/>
+          <w:sz w:val="27"/>
+          <w:szCs w:val="27"/>
+        </w:rPr>
+      </w:pPr>
+    </w:p>
+    <w:p>
+      <w:pPr>
+        <w:pStyle w:val="Heading1"/>
+        <w:spacing w:before="260" w:after="120"/>
+        <w:rPr>
+          <w:b/>
+          <w:bCs/>
+          <w:color w:val="000000"/>
+          <w:sz w:val="27"/>
+          <w:szCs w:val="27"/>
+        </w:rPr>
+      </w:pPr>
+    </w:p>
+    <w:p>
+      <w:pPr>
+        <w:pStyle w:val="Heading1"/>
+        <w:spacing w:before="260" w:after="120"/>
+      </w:pPr>
+      <w:r>
+        <w:rPr>
+          <w:b/>
+          <w:bCs/>
+          <w:color w:val="000000"/>
+          <w:sz w:val="27"/>
+          <w:szCs w:val="27"/>
+        </w:rPr>
+        <w:lastRenderedPageBreak/>
         <w:t>Appendix A. Implementation choices</w:t>
       </w:r>
     </w:p>
@@ -6147,7 +6204,6 @@
         <w:rPr>
           <w:noProof/>
         </w:rPr>
-        <w:lastRenderedPageBreak/>
         <w:drawing>
           <wp:inline distT="0" distB="0" distL="0" distR="0" wp14:anchorId="7032E6DE" wp14:editId="6BCFD4B9">
             <wp:extent cx="895350" cy="266700"/>
@@ -6210,6 +6266,7 @@
         <w:rPr>
           <w:noProof/>
         </w:rPr>
+        <w:lastRenderedPageBreak/>
         <w:drawing>
           <wp:inline distT="0" distB="0" distL="0" distR="0" wp14:anchorId="1F20A3A3" wp14:editId="42326361">
             <wp:extent cx="1457325" cy="266700"/>
@@ -9080,10 +9137,7 @@
         <w:t>Interpretive statement</w:t>
       </w:r>
       <w:r>
-        <w:t xml:space="preserve">. </w:t>
-      </w:r>
-      <w:r>
-        <w:t>The proposed explanation of the o</w:t>
+        <w:t>. The proposed explanation of the o</w:t>
       </w:r>
       <w:r>
         <w:t>ptimizer</w:t>
@@ -10243,7 +10297,7 @@
 </file>
 
 <file path=customXml/itemProps1.xml><?xml version="1.0" encoding="utf-8"?>
-<ds:datastoreItem xmlns:ds="http://schemas.openxmlformats.org/officeDocument/2006/customXml" ds:itemID="{5E6270B3-4CCD-004B-BF73-92C0EFFF9ED7}">
+<ds:datastoreItem xmlns:ds="http://schemas.openxmlformats.org/officeDocument/2006/customXml" ds:itemID="{972E2CE1-5556-024C-A048-F2BB78953324}">
   <ds:schemaRefs>
     <ds:schemaRef ds:uri="http://schemas.openxmlformats.org/officeDocument/2006/bibliography"/>
   </ds:schemaRefs>

</xml_diff>

<commit_message>
minor tweaks to the report
</commit_message>
<xml_diff>
--- a/docs/MarketStructure_Report.docx
+++ b/docs/MarketStructure_Report.docx
@@ -433,7 +433,21 @@
           <w:b/>
           <w:bCs/>
         </w:rPr>
-        <w:t>Entropy-based ENB (Meucci, 2010):</w:t>
+        <w:t>Entropy-based ENB (Meucci, 20</w:t>
+      </w:r>
+      <w:r>
+        <w:rPr>
+          <w:b/>
+          <w:bCs/>
+        </w:rPr>
+        <w:t>09</w:t>
+      </w:r>
+      <w:r>
+        <w:rPr>
+          <w:b/>
+          <w:bCs/>
+        </w:rPr>
+        <w:t>):</w:t>
       </w:r>
     </w:p>
     <w:p>
@@ -1183,12 +1197,6 @@
         <w:gridCol w:w="900"/>
       </w:tblGrid>
       <w:tr>
-        <w:tblPrEx>
-          <w:tblCellMar>
-            <w:top w:w="0" w:type="dxa"/>
-            <w:bottom w:w="0" w:type="dxa"/>
-          </w:tblCellMar>
-        </w:tblPrEx>
         <w:trPr>
           <w:tblHeader/>
         </w:trPr>
@@ -1390,12 +1398,6 @@
         </w:tc>
       </w:tr>
       <w:tr>
-        <w:tblPrEx>
-          <w:tblCellMar>
-            <w:top w:w="0" w:type="dxa"/>
-            <w:bottom w:w="0" w:type="dxa"/>
-          </w:tblCellMar>
-        </w:tblPrEx>
         <w:tc>
           <w:tcPr>
             <w:tcW w:w="2400" w:type="dxa"/>
@@ -1547,12 +1549,6 @@
         </w:tc>
       </w:tr>
       <w:tr>
-        <w:tblPrEx>
-          <w:tblCellMar>
-            <w:top w:w="0" w:type="dxa"/>
-            <w:bottom w:w="0" w:type="dxa"/>
-          </w:tblCellMar>
-        </w:tblPrEx>
         <w:tc>
           <w:tcPr>
             <w:tcW w:w="2400" w:type="dxa"/>
@@ -1709,12 +1705,6 @@
         </w:tc>
       </w:tr>
       <w:tr>
-        <w:tblPrEx>
-          <w:tblCellMar>
-            <w:top w:w="0" w:type="dxa"/>
-            <w:bottom w:w="0" w:type="dxa"/>
-          </w:tblCellMar>
-        </w:tblPrEx>
         <w:tc>
           <w:tcPr>
             <w:tcW w:w="2400" w:type="dxa"/>
@@ -1866,12 +1856,6 @@
         </w:tc>
       </w:tr>
       <w:tr>
-        <w:tblPrEx>
-          <w:tblCellMar>
-            <w:top w:w="0" w:type="dxa"/>
-            <w:bottom w:w="0" w:type="dxa"/>
-          </w:tblCellMar>
-        </w:tblPrEx>
         <w:tc>
           <w:tcPr>
             <w:tcW w:w="2400" w:type="dxa"/>
@@ -2028,12 +2012,6 @@
         </w:tc>
       </w:tr>
       <w:tr>
-        <w:tblPrEx>
-          <w:tblCellMar>
-            <w:top w:w="0" w:type="dxa"/>
-            <w:bottom w:w="0" w:type="dxa"/>
-          </w:tblCellMar>
-        </w:tblPrEx>
         <w:tc>
           <w:tcPr>
             <w:tcW w:w="2400" w:type="dxa"/>
@@ -2379,12 +2357,6 @@
         <w:gridCol w:w="1450"/>
       </w:tblGrid>
       <w:tr>
-        <w:tblPrEx>
-          <w:tblCellMar>
-            <w:top w:w="0" w:type="dxa"/>
-            <w:bottom w:w="0" w:type="dxa"/>
-          </w:tblCellMar>
-        </w:tblPrEx>
         <w:trPr>
           <w:tblHeader/>
         </w:trPr>
@@ -2588,12 +2560,6 @@
         </w:tc>
       </w:tr>
       <w:tr>
-        <w:tblPrEx>
-          <w:tblCellMar>
-            <w:top w:w="0" w:type="dxa"/>
-            <w:bottom w:w="0" w:type="dxa"/>
-          </w:tblCellMar>
-        </w:tblPrEx>
         <w:tc>
           <w:tcPr>
             <w:tcW w:w="2500" w:type="dxa"/>
@@ -2775,12 +2741,6 @@
         </w:tc>
       </w:tr>
       <w:tr>
-        <w:tblPrEx>
-          <w:tblCellMar>
-            <w:top w:w="0" w:type="dxa"/>
-            <w:bottom w:w="0" w:type="dxa"/>
-          </w:tblCellMar>
-        </w:tblPrEx>
         <w:tc>
           <w:tcPr>
             <w:tcW w:w="2500" w:type="dxa"/>
@@ -2968,12 +2928,6 @@
         </w:tc>
       </w:tr>
       <w:tr>
-        <w:tblPrEx>
-          <w:tblCellMar>
-            <w:top w:w="0" w:type="dxa"/>
-            <w:bottom w:w="0" w:type="dxa"/>
-          </w:tblCellMar>
-        </w:tblPrEx>
         <w:tc>
           <w:tcPr>
             <w:tcW w:w="2500" w:type="dxa"/>
@@ -3155,12 +3109,6 @@
         </w:tc>
       </w:tr>
       <w:tr>
-        <w:tblPrEx>
-          <w:tblCellMar>
-            <w:top w:w="0" w:type="dxa"/>
-            <w:bottom w:w="0" w:type="dxa"/>
-          </w:tblCellMar>
-        </w:tblPrEx>
         <w:tc>
           <w:tcPr>
             <w:tcW w:w="2500" w:type="dxa"/>
@@ -3348,12 +3296,6 @@
         </w:tc>
       </w:tr>
       <w:tr>
-        <w:tblPrEx>
-          <w:tblCellMar>
-            <w:top w:w="0" w:type="dxa"/>
-            <w:bottom w:w="0" w:type="dxa"/>
-          </w:tblCellMar>
-        </w:tblPrEx>
         <w:tc>
           <w:tcPr>
             <w:tcW w:w="2500" w:type="dxa"/>
@@ -3583,12 +3525,6 @@
         <w:gridCol w:w="1550"/>
       </w:tblGrid>
       <w:tr>
-        <w:tblPrEx>
-          <w:tblCellMar>
-            <w:top w:w="0" w:type="dxa"/>
-            <w:bottom w:w="0" w:type="dxa"/>
-          </w:tblCellMar>
-        </w:tblPrEx>
         <w:trPr>
           <w:tblHeader/>
         </w:trPr>
@@ -3727,12 +3663,6 @@
         </w:tc>
       </w:tr>
       <w:tr>
-        <w:tblPrEx>
-          <w:tblCellMar>
-            <w:top w:w="0" w:type="dxa"/>
-            <w:bottom w:w="0" w:type="dxa"/>
-          </w:tblCellMar>
-        </w:tblPrEx>
         <w:tc>
           <w:tcPr>
             <w:tcW w:w="2500" w:type="dxa"/>
@@ -3854,12 +3784,6 @@
         </w:tc>
       </w:tr>
       <w:tr>
-        <w:tblPrEx>
-          <w:tblCellMar>
-            <w:top w:w="0" w:type="dxa"/>
-            <w:bottom w:w="0" w:type="dxa"/>
-          </w:tblCellMar>
-        </w:tblPrEx>
         <w:tc>
           <w:tcPr>
             <w:tcW w:w="2500" w:type="dxa"/>
@@ -3985,12 +3909,6 @@
         </w:tc>
       </w:tr>
       <w:tr>
-        <w:tblPrEx>
-          <w:tblCellMar>
-            <w:top w:w="0" w:type="dxa"/>
-            <w:bottom w:w="0" w:type="dxa"/>
-          </w:tblCellMar>
-        </w:tblPrEx>
         <w:tc>
           <w:tcPr>
             <w:tcW w:w="2500" w:type="dxa"/>
@@ -4112,12 +4030,6 @@
         </w:tc>
       </w:tr>
       <w:tr>
-        <w:tblPrEx>
-          <w:tblCellMar>
-            <w:top w:w="0" w:type="dxa"/>
-            <w:bottom w:w="0" w:type="dxa"/>
-          </w:tblCellMar>
-        </w:tblPrEx>
         <w:tc>
           <w:tcPr>
             <w:tcW w:w="2500" w:type="dxa"/>
@@ -4243,12 +4155,6 @@
         </w:tc>
       </w:tr>
       <w:tr>
-        <w:tblPrEx>
-          <w:tblCellMar>
-            <w:top w:w="0" w:type="dxa"/>
-            <w:bottom w:w="0" w:type="dxa"/>
-          </w:tblCellMar>
-        </w:tblPrEx>
         <w:tc>
           <w:tcPr>
             <w:tcW w:w="2500" w:type="dxa"/>
@@ -4449,7 +4355,7 @@
           <w:sz w:val="18"/>
           <w:szCs w:val="18"/>
         </w:rPr>
-        <w:t>Figure 5. Entropy-ENB indexed to 100 at each episode's key date, at matched trading-day checkpoints (−21, −5, 0, 5, 21, 63). Full continuous event studies for each episode are in Appendix E.</w:t>
+        <w:t>Figure 5. Event-study comparison of entropy-ENB across three crises, indexed to 100 at each episode's key date. Minimum variance (left) and maximum diversification (right); the other three portfolios are omitted here for scale and shown individually in Appendix E.</w:t>
       </w:r>
     </w:p>
     <w:p>
@@ -4487,7 +4393,7 @@
         <w:t xml:space="preserve">. The break, when it came, was sudden and severe: entropy-ENB for minimum variance and maximum diversification fell 74% and 55% respectively in the six weeks around Lehman's 15 September bankruptcy (Table 3), and unlike the other two episodes, neither portfolio had recovered even half its pre-crisis level three months later (Figure 5). The absorption ratio kept climbing for nearly three months after Lehman, and the minimum-variance optimizer's holdings followed the same delayed pattern, bottoming at just 13 names in </w:t>
       </w:r>
       <w:r>
-        <w:t>early</w:t>
+        <w:t>late</w:t>
       </w:r>
       <w:r>
         <w:t xml:space="preserve"> December. The GFC's damage was not only the deepest of the three episodes, but the only one that hadn't started healing by the end of its own acute window.</w:t>
@@ -4521,10 +4427,7 @@
         <w:t xml:space="preserve">. The analogy breaks down on depth and recovery, however. The collapse was GFC-deep (entropy-ENB fell 70% and 71% for minimum variance and maximum diversification, Table 3) rather than tariff-shallow, and </w:t>
       </w:r>
       <w:r>
-        <w:t>m</w:t>
-      </w:r>
-      <w:r>
-        <w:t xml:space="preserve">inimum variance's rebound overshot dramatically, climbing to 5.7x </w:t>
+        <w:t xml:space="preserve">minimum variance's rebound overshot dramatically, climbing to 5.7x </w:t>
       </w:r>
       <w:r>
         <w:t xml:space="preserve">the declaration date </w:t>
@@ -4730,12 +4633,6 @@
         <w:gridCol w:w="2700"/>
       </w:tblGrid>
       <w:tr>
-        <w:tblPrEx>
-          <w:tblCellMar>
-            <w:top w:w="0" w:type="dxa"/>
-            <w:bottom w:w="0" w:type="dxa"/>
-          </w:tblCellMar>
-        </w:tblPrEx>
         <w:trPr>
           <w:tblHeader/>
         </w:trPr>
@@ -4840,12 +4737,6 @@
         </w:tc>
       </w:tr>
       <w:tr>
-        <w:tblPrEx>
-          <w:tblCellMar>
-            <w:top w:w="0" w:type="dxa"/>
-            <w:bottom w:w="0" w:type="dxa"/>
-          </w:tblCellMar>
-        </w:tblPrEx>
         <w:tc>
           <w:tcPr>
             <w:tcW w:w="1800" w:type="dxa"/>
@@ -4937,12 +4828,6 @@
         </w:tc>
       </w:tr>
       <w:tr>
-        <w:tblPrEx>
-          <w:tblCellMar>
-            <w:top w:w="0" w:type="dxa"/>
-            <w:bottom w:w="0" w:type="dxa"/>
-          </w:tblCellMar>
-        </w:tblPrEx>
         <w:tc>
           <w:tcPr>
             <w:tcW w:w="1800" w:type="dxa"/>
@@ -5046,12 +4931,6 @@
         </w:tc>
       </w:tr>
       <w:tr>
-        <w:tblPrEx>
-          <w:tblCellMar>
-            <w:top w:w="0" w:type="dxa"/>
-            <w:bottom w:w="0" w:type="dxa"/>
-          </w:tblCellMar>
-        </w:tblPrEx>
         <w:tc>
           <w:tcPr>
             <w:tcW w:w="1800" w:type="dxa"/>
@@ -5143,12 +5022,6 @@
         </w:tc>
       </w:tr>
       <w:tr>
-        <w:tblPrEx>
-          <w:tblCellMar>
-            <w:top w:w="0" w:type="dxa"/>
-            <w:bottom w:w="0" w:type="dxa"/>
-          </w:tblCellMar>
-        </w:tblPrEx>
         <w:tc>
           <w:tcPr>
             <w:tcW w:w="1800" w:type="dxa"/>
@@ -5275,12 +5148,6 @@
         </w:tc>
       </w:tr>
       <w:tr>
-        <w:tblPrEx>
-          <w:tblCellMar>
-            <w:top w:w="0" w:type="dxa"/>
-            <w:bottom w:w="0" w:type="dxa"/>
-          </w:tblCellMar>
-        </w:tblPrEx>
         <w:tc>
           <w:tcPr>
             <w:tcW w:w="1800" w:type="dxa"/>
@@ -5372,12 +5239,6 @@
         </w:tc>
       </w:tr>
       <w:tr>
-        <w:tblPrEx>
-          <w:tblCellMar>
-            <w:top w:w="0" w:type="dxa"/>
-            <w:bottom w:w="0" w:type="dxa"/>
-          </w:tblCellMar>
-        </w:tblPrEx>
         <w:tc>
           <w:tcPr>
             <w:tcW w:w="1800" w:type="dxa"/>
@@ -6889,12 +6750,6 @@
         <w:gridCol w:w="1500"/>
       </w:tblGrid>
       <w:tr>
-        <w:tblPrEx>
-          <w:tblCellMar>
-            <w:top w:w="0" w:type="dxa"/>
-            <w:bottom w:w="0" w:type="dxa"/>
-          </w:tblCellMar>
-        </w:tblPrEx>
         <w:trPr>
           <w:tblHeader/>
         </w:trPr>
@@ -7065,12 +6920,6 @@
         </w:tc>
       </w:tr>
       <w:tr>
-        <w:tblPrEx>
-          <w:tblCellMar>
-            <w:top w:w="0" w:type="dxa"/>
-            <w:bottom w:w="0" w:type="dxa"/>
-          </w:tblCellMar>
-        </w:tblPrEx>
         <w:tc>
           <w:tcPr>
             <w:tcW w:w="1550" w:type="dxa"/>
@@ -7231,12 +7080,6 @@
         </w:tc>
       </w:tr>
       <w:tr>
-        <w:tblPrEx>
-          <w:tblCellMar>
-            <w:top w:w="0" w:type="dxa"/>
-            <w:bottom w:w="0" w:type="dxa"/>
-          </w:tblCellMar>
-        </w:tblPrEx>
         <w:tc>
           <w:tcPr>
             <w:tcW w:w="1550" w:type="dxa"/>
@@ -7402,12 +7245,6 @@
         </w:tc>
       </w:tr>
       <w:tr>
-        <w:tblPrEx>
-          <w:tblCellMar>
-            <w:top w:w="0" w:type="dxa"/>
-            <w:bottom w:w="0" w:type="dxa"/>
-          </w:tblCellMar>
-        </w:tblPrEx>
         <w:tc>
           <w:tcPr>
             <w:tcW w:w="1550" w:type="dxa"/>
@@ -7577,12 +7414,6 @@
         </w:tc>
       </w:tr>
       <w:tr>
-        <w:tblPrEx>
-          <w:tblCellMar>
-            <w:top w:w="0" w:type="dxa"/>
-            <w:bottom w:w="0" w:type="dxa"/>
-          </w:tblCellMar>
-        </w:tblPrEx>
         <w:tc>
           <w:tcPr>
             <w:tcW w:w="1550" w:type="dxa"/>
@@ -7764,12 +7595,6 @@
         </w:tc>
       </w:tr>
       <w:tr>
-        <w:tblPrEx>
-          <w:tblCellMar>
-            <w:top w:w="0" w:type="dxa"/>
-            <w:bottom w:w="0" w:type="dxa"/>
-          </w:tblCellMar>
-        </w:tblPrEx>
         <w:tc>
           <w:tcPr>
             <w:tcW w:w="1550" w:type="dxa"/>
@@ -8926,6 +8751,15 @@
       <w:proofErr w:type="spellEnd"/>
       <w:r>
         <w:t>, O., &amp; Wolf, M. (2004). Honey, I Shrunk the Sample Covariance Matrix. Journal of Portfolio Management, 30(4), 110–119.</w:t>
+      </w:r>
+    </w:p>
+    <w:p>
+      <w:pPr>
+        <w:spacing w:after="100" w:line="276" w:lineRule="auto"/>
+        <w:jc w:val="both"/>
+      </w:pPr>
+      <w:r>
+        <w:t>Spinu, F. (2013). An Algorithm for Computing Risk Parity Weights. Available at SSRN: ssrn.com/abstract=2297383.</w:t>
       </w:r>
     </w:p>
     <w:sectPr>

</xml_diff>